<commit_message>
fix: drop LaTeX math from markdown so GitHub renders the report
</commit_message>
<xml_diff>
--- a/report.docx
+++ b/report.docx
@@ -148,35 +148,7 @@
           <w:b/>
           <w:bCs/>
         </w:rPr>
-        <w:t xml:space="preserve">Residual Gradient Boosted Machine (</w:t>
-      </w:r>
-      <m:oMath>
-        <m:sSub>
-          <m:e>
-            <m:r>
-              <m:t>L</m:t>
-            </m:r>
-          </m:e>
-          <m:sub>
-            <m:r>
-              <m:t>1</m:t>
-            </m:r>
-          </m:sub>
-        </m:sSub>
-      </m:oMath>
-      <w:r>
-        <w:rPr>
-          <w:b/>
-          <w:bCs/>
-        </w:rPr>
-        <w:t xml:space="preserve"> </w:t>
-      </w:r>
-      <w:r>
-        <w:rPr>
-          <w:b/>
-          <w:bCs/>
-        </w:rPr>
-        <w:t xml:space="preserve">loss)</w:t>
+        <w:t xml:space="preserve">Residual Gradient Boosted Machine (L1 loss)</w:t>
       </w:r>
       <w:r>
         <w:t xml:space="preserve"> </w:t>
@@ -378,24 +350,7 @@
         <w:t xml:space="preserve"> </w:t>
       </w:r>
       <w:r>
-        <w:t xml:space="preserve">(</w:t>
-      </w:r>
-      <m:oMath>
-        <m:r>
-          <m:t>r</m:t>
-        </m:r>
-        <m:r>
-          <m:rPr>
-            <m:sty m:val="p"/>
-          </m:rPr>
-          <m:t>=</m:t>
-        </m:r>
-        <m:r>
-          <m:t>0.8987</m:t>
-        </m:r>
-      </m:oMath>
-      <w:r>
-        <w:t xml:space="preserve">). However, the relationship is non-linear:</w:t>
+        <w:t xml:space="preserve">(r = 0.8987). However, the relationship is non-linear:</w:t>
       </w:r>
       <w:r>
         <w:t xml:space="preserve"> </w:t>
@@ -414,36 +369,7 @@
         <w:t xml:space="preserve">Short-Haul Premium (Haul Inefficiency)</w:t>
       </w:r>
       <w:r>
-        <w:t xml:space="preserve">: Loads under 450 miles exhibit significantly higher rates per mile (</w:t>
-      </w:r>
-      <m:oMath>
-        <m:r>
-          <m:t>R</m:t>
-        </m:r>
-        <m:r>
-          <m:t>P</m:t>
-        </m:r>
-        <m:r>
-          <m:t>M</m:t>
-        </m:r>
-        <m:r>
-          <m:rPr>
-            <m:sty m:val="p"/>
-          </m:rPr>
-          <m:t>&gt;</m:t>
-        </m:r>
-        <m:r>
-          <m:rPr>
-            <m:sty m:val="p"/>
-          </m:rPr>
-          <m:t>$</m:t>
-        </m:r>
-        <m:r>
-          <m:t>2.60</m:t>
-        </m:r>
-      </m:oMath>
-      <w:r>
-        <w:t xml:space="preserve">) due to fixed loading/unloading detention times and terminal handling costs.</w:t>
+        <w:t xml:space="preserve">: Loads under 450 miles exhibit significantly higher rates per mile (RPM &gt; $2.60) due to fixed loading/unloading detention times and terminal handling costs.</w:t>
       </w:r>
       <w:r>
         <w:t xml:space="preserve"> </w:t>
@@ -950,27 +876,7 @@
               <w:jc w:val="left"/>
             </w:pPr>
             <w:r>
-              <w:t xml:space="preserve">Enforced a hard business floor (</w:t>
-            </w:r>
-            <m:oMath>
-              <m:r>
-                <m:rPr>
-                  <m:sty m:val="p"/>
-                </m:rPr>
-                <m:t>≥</m:t>
-              </m:r>
-              <m:r>
-                <m:rPr>
-                  <m:sty m:val="p"/>
-                </m:rPr>
-                <m:t>$</m:t>
-              </m:r>
-              <m:r>
-                <m:t>50.00</m:t>
-              </m:r>
-            </m:oMath>
-            <w:r>
-              <w:t xml:space="preserve">) on final model outputs to ensure operational realism.</w:t>
+              <w:t xml:space="preserve">Enforced a hard business floor (minimum $50.00) on final model outputs to ensure operational realism.</w:t>
             </w:r>
           </w:p>
         </w:tc>
@@ -1208,22 +1114,8 @@
               <w:pStyle w:val="Compact"/>
               <w:jc w:val="center"/>
             </w:pPr>
-            <m:oMath>
-              <m:sSup>
-                <m:e>
-                  <m:r>
-                    <m:t>R</m:t>
-                  </m:r>
-                </m:e>
-                <m:sup>
-                  <m:r>
-                    <m:t>2</m:t>
-                  </m:r>
-                </m:sup>
-              </m:sSup>
-            </m:oMath>
-            <w:r>
-              <w:t xml:space="preserve">​</w:t>
+            <w:r>
+              <w:t xml:space="preserve">R²</w:t>
             </w:r>
           </w:p>
         </w:tc>
@@ -1336,25 +1228,8 @@
               <w:pStyle w:val="Compact"/>
               <w:jc w:val="center"/>
             </w:pPr>
-            <m:oMath>
-              <m:sSub>
-                <m:e>
-                  <m:r>
-                    <m:t>L</m:t>
-                  </m:r>
-                </m:e>
-                <m:sub>
-                  <m:r>
-                    <m:t>2</m:t>
-                  </m:r>
-                </m:sub>
-              </m:sSub>
-            </m:oMath>
-            <w:r>
-              <w:t xml:space="preserve"> </w:t>
-            </w:r>
-            <w:r>
-              <w:t xml:space="preserve">(MSE)</w:t>
+            <w:r>
+              <w:t xml:space="preserve">L2 (MSE)</w:t>
             </w:r>
           </w:p>
         </w:tc>
@@ -1424,25 +1299,8 @@
               <w:pStyle w:val="Compact"/>
               <w:jc w:val="center"/>
             </w:pPr>
-            <m:oMath>
-              <m:sSub>
-                <m:e>
-                  <m:r>
-                    <m:t>L</m:t>
-                  </m:r>
-                </m:e>
-                <m:sub>
-                  <m:r>
-                    <m:t>2</m:t>
-                  </m:r>
-                </m:sub>
-              </m:sSub>
-            </m:oMath>
-            <w:r>
-              <w:t xml:space="preserve"> </w:t>
-            </w:r>
-            <w:r>
-              <w:t xml:space="preserve">(MSE)</w:t>
+            <w:r>
+              <w:t xml:space="preserve">L2 (MSE)</w:t>
             </w:r>
           </w:p>
         </w:tc>
@@ -1503,25 +1361,8 @@
               <w:pStyle w:val="Compact"/>
               <w:jc w:val="center"/>
             </w:pPr>
-            <m:oMath>
-              <m:sSub>
-                <m:e>
-                  <m:r>
-                    <m:t>L</m:t>
-                  </m:r>
-                </m:e>
-                <m:sub>
-                  <m:r>
-                    <m:t>2</m:t>
-                  </m:r>
-                </m:sub>
-              </m:sSub>
-            </m:oMath>
-            <w:r>
-              <w:t xml:space="preserve"> </w:t>
-            </w:r>
-            <w:r>
-              <w:t xml:space="preserve">(MSE)</w:t>
+            <w:r>
+              <w:t xml:space="preserve">L2 (MSE)</w:t>
             </w:r>
           </w:p>
         </w:tc>
@@ -1544,175 +1385,54 @@
               <w:pStyle w:val="Compact"/>
               <w:jc w:val="center"/>
             </w:pPr>
-            <m:oMath>
-              <m:r>
-                <m:t>649.31</m:t>
-              </m:r>
-              <m:r>
-                <m:rPr>
-                  <m:sty m:val="p"/>
-                </m:rPr>
-                <m:t>|</m:t>
-              </m:r>
-              <m:r>
-                <m:t>0.820</m:t>
-              </m:r>
-              <m:r>
-                <m:rPr>
-                  <m:sty m:val="p"/>
-                </m:rPr>
-                <m:t>|</m:t>
-              </m:r>
-              <m:r>
-                <m:rPr>
-                  <m:sty m:val="p"/>
-                </m:rPr>
-                <m:t>|</m:t>
-              </m:r>
-              <m:r>
-                <m:rPr>
-                  <m:sty m:val="p"/>
-                </m:rPr>
-                <m:t>*</m:t>
-              </m:r>
-              <m:r>
-                <m:rPr>
-                  <m:sty m:val="p"/>
-                </m:rPr>
-                <m:t>*</m:t>
-              </m:r>
-              <m:r>
-                <m:t>R</m:t>
-              </m:r>
-              <m:r>
-                <m:t>e</m:t>
-              </m:r>
-              <m:r>
-                <m:t>s</m:t>
-              </m:r>
-              <m:r>
-                <m:t>i</m:t>
-              </m:r>
-              <m:r>
-                <m:t>d</m:t>
-              </m:r>
-              <m:r>
-                <m:t>u</m:t>
-              </m:r>
-              <m:r>
-                <m:t>a</m:t>
-              </m:r>
-              <m:r>
-                <m:t>l</m:t>
-              </m:r>
-              <m:r>
-                <m:t>L</m:t>
-              </m:r>
-              <m:r>
-                <m:t>i</m:t>
-              </m:r>
-              <m:r>
-                <m:t>g</m:t>
-              </m:r>
-              <m:r>
-                <m:t>h</m:t>
-              </m:r>
-              <m:r>
-                <m:t>t</m:t>
-              </m:r>
-              <m:r>
-                <m:t>G</m:t>
-              </m:r>
-              <m:r>
-                <m:t>B</m:t>
-              </m:r>
-              <m:r>
-                <m:t>M</m:t>
-              </m:r>
-              <m:r>
-                <m:rPr>
-                  <m:sty m:val="p"/>
-                </m:rPr>
-                <m:t>[</m:t>
-              </m:r>
-              <m:r>
-                <m:t>F</m:t>
-              </m:r>
-              <m:r>
-                <m:t>i</m:t>
-              </m:r>
-              <m:r>
-                <m:t>n</m:t>
-              </m:r>
-              <m:r>
-                <m:t>a</m:t>
-              </m:r>
-              <m:r>
-                <m:t>l</m:t>
-              </m:r>
-              <m:r>
-                <m:t>S</m:t>
-              </m:r>
-              <m:r>
-                <m:t>o</m:t>
-              </m:r>
-              <m:r>
-                <m:t>l</m:t>
-              </m:r>
-              <m:r>
-                <m:t>u</m:t>
-              </m:r>
-              <m:r>
-                <m:t>t</m:t>
-              </m:r>
-              <m:r>
-                <m:t>i</m:t>
-              </m:r>
-              <m:r>
-                <m:t>o</m:t>
-              </m:r>
-              <m:r>
-                <m:t>n</m:t>
-              </m:r>
-              <m:r>
-                <m:rPr>
-                  <m:sty m:val="p"/>
-                </m:rPr>
-                <m:t>]</m:t>
-              </m:r>
-              <m:r>
-                <m:rPr>
-                  <m:sty m:val="p"/>
-                </m:rPr>
-                <m:t>*</m:t>
-              </m:r>
-              <m:r>
-                <m:rPr>
-                  <m:sty m:val="p"/>
-                </m:rPr>
-                <m:t>*</m:t>
-              </m:r>
-              <m:r>
-                <m:rPr>
-                  <m:sty m:val="p"/>
-                </m:rPr>
-                <m:t>|</m:t>
-              </m:r>
-              <m:r>
-                <m:rPr>
-                  <m:sty m:val="p"/>
-                </m:rPr>
-                <m:t>*</m:t>
-              </m:r>
-              <m:r>
-                <m:rPr>
-                  <m:sty m:val="p"/>
-                </m:rPr>
-                <m:t>*</m:t>
-              </m:r>
-            </m:oMath>
-            <w:r>
-              <w:t xml:space="preserve">L_1$ (MAE)**</w:t>
+            <w:r>
+              <w:t xml:space="preserve">$649.31</w:t>
+            </w:r>
+          </w:p>
+        </w:tc>
+        <w:tc>
+          <w:tcPr/>
+          <w:p>
+            <w:pPr>
+              <w:pStyle w:val="Compact"/>
+              <w:jc w:val="center"/>
+            </w:pPr>
+            <w:r>
+              <w:t xml:space="preserve">0.820</w:t>
+            </w:r>
+          </w:p>
+        </w:tc>
+      </w:tr>
+      <w:tr>
+        <w:tc>
+          <w:tcPr/>
+          <w:p>
+            <w:pPr>
+              <w:pStyle w:val="Compact"/>
+              <w:jc w:val="left"/>
+            </w:pPr>
+            <w:r>
+              <w:rPr>
+                <w:b/>
+                <w:bCs/>
+              </w:rPr>
+              <w:t xml:space="preserve">Residual LightGBM [Final Solution]</w:t>
+            </w:r>
+          </w:p>
+        </w:tc>
+        <w:tc>
+          <w:tcPr/>
+          <w:p>
+            <w:pPr>
+              <w:pStyle w:val="Compact"/>
+              <w:jc w:val="center"/>
+            </w:pPr>
+            <w:r>
+              <w:rPr>
+                <w:b/>
+                <w:bCs/>
+              </w:rPr>
+              <w:t xml:space="preserve">L1 (MAE)</w:t>
             </w:r>
           </w:p>
         </w:tc>
@@ -1732,6 +1452,38 @@
             </w:r>
           </w:p>
         </w:tc>
+        <w:tc>
+          <w:tcPr/>
+          <w:p>
+            <w:pPr>
+              <w:pStyle w:val="Compact"/>
+              <w:jc w:val="center"/>
+            </w:pPr>
+            <w:r>
+              <w:rPr>
+                <w:b/>
+                <w:bCs/>
+              </w:rPr>
+              <w:t xml:space="preserve">$635.66</w:t>
+            </w:r>
+          </w:p>
+        </w:tc>
+        <w:tc>
+          <w:tcPr/>
+          <w:p>
+            <w:pPr>
+              <w:pStyle w:val="Compact"/>
+              <w:jc w:val="center"/>
+            </w:pPr>
+            <w:r>
+              <w:rPr>
+                <w:b/>
+                <w:bCs/>
+              </w:rPr>
+              <w:t xml:space="preserve">0.826</w:t>
+            </w:r>
+          </w:p>
+        </w:tc>
       </w:tr>
     </w:tbl>
     <w:p>
@@ -1746,30 +1498,7 @@
         <w:t xml:space="preserve">Why Residual Modeling Wins</w:t>
       </w:r>
       <w:r>
-        <w:t xml:space="preserve">: Residual modeling centers the loss function around high-leverage market deviations rather than distance scale, preventing cross-country hauls from dominating gradient tree splits. Using</w:t>
-      </w:r>
-      <w:r>
-        <w:t xml:space="preserve"> </w:t>
-      </w:r>
-      <m:oMath>
-        <m:sSub>
-          <m:e>
-            <m:r>
-              <m:t>L</m:t>
-            </m:r>
-          </m:e>
-          <m:sub>
-            <m:r>
-              <m:t>1</m:t>
-            </m:r>
-          </m:sub>
-        </m:sSub>
-      </m:oMath>
-      <w:r>
-        <w:t xml:space="preserve"> </w:t>
-      </w:r>
-      <w:r>
-        <w:t xml:space="preserve">loss provides robust immunity against extreme carrier outlier quotes.</w:t>
+        <w:t xml:space="preserve">: Residual modeling centers the loss function around high-leverage market deviations rather than distance scale, preventing cross-country hauls from dominating gradient tree splits. Using L1 loss provides robust immunity against extreme carrier outlier quotes.</w:t>
       </w:r>
     </w:p>
     <w:p>
@@ -2112,7 +1841,7 @@
         <w:rPr>
           <w:rStyle w:val="VerbatimChar"/>
         </w:rPr>
-        <w:t xml:space="preserve">├── README.md                          # Project overview and run instructions</w:t>
+        <w:t xml:space="preserve">|-- README.md                          # Project overview and run instructions</w:t>
       </w:r>
       <w:r>
         <w:br/>
@@ -2121,7 +1850,7 @@
         <w:rPr>
           <w:rStyle w:val="VerbatimChar"/>
         </w:rPr>
-        <w:t xml:space="preserve">├── REPORT.md                          # Comprehensive technical report (this document)</w:t>
+        <w:t xml:space="preserve">|-- REPORT.md                          # Comprehensive technical report (this document)</w:t>
       </w:r>
       <w:r>
         <w:br/>
@@ -2130,7 +1859,7 @@
         <w:rPr>
           <w:rStyle w:val="VerbatimChar"/>
         </w:rPr>
-        <w:t xml:space="preserve">├── requirements.txt                   # Production dependencies</w:t>
+        <w:t xml:space="preserve">|-- report.pdf                         # PDF version of this report</w:t>
       </w:r>
       <w:r>
         <w:br/>
@@ -2139,7 +1868,7 @@
         <w:rPr>
           <w:rStyle w:val="VerbatimChar"/>
         </w:rPr>
-        <w:t xml:space="preserve">├── solution.py                        # End-to-end training and prediction pipeline</w:t>
+        <w:t xml:space="preserve">|-- requirements.txt                   # Production dependencies</w:t>
       </w:r>
       <w:r>
         <w:br/>
@@ -2148,7 +1877,7 @@
         <w:rPr>
           <w:rStyle w:val="VerbatimChar"/>
         </w:rPr>
-        <w:t xml:space="preserve">├── score.py                           # Official Spotter evaluation and chart generator</w:t>
+        <w:t xml:space="preserve">|-- solution.py                        # End-to-end training and prediction pipeline</w:t>
       </w:r>
       <w:r>
         <w:br/>
@@ -2157,7 +1886,7 @@
         <w:rPr>
           <w:rStyle w:val="VerbatimChar"/>
         </w:rPr>
-        <w:t xml:space="preserve">├── data/</w:t>
+        <w:t xml:space="preserve">|-- score.py                           # Official Spotter evaluation and chart generator</w:t>
       </w:r>
       <w:r>
         <w:br/>
@@ -2166,7 +1895,7 @@
         <w:rPr>
           <w:rStyle w:val="VerbatimChar"/>
         </w:rPr>
-        <w:t xml:space="preserve">│   ├── train_test.csv                 # 48,000 labeled development loads</w:t>
+        <w:t xml:space="preserve">|-- data/</w:t>
       </w:r>
       <w:r>
         <w:br/>
@@ -2175,7 +1904,7 @@
         <w:rPr>
           <w:rStyle w:val="VerbatimChar"/>
         </w:rPr>
-        <w:t xml:space="preserve">│   ├── validation.csv                 # 12,000 loads requiring predictions</w:t>
+        <w:t xml:space="preserve">|   |-- train_test.csv                 # 48,000 labeled development loads</w:t>
       </w:r>
       <w:r>
         <w:br/>
@@ -2184,7 +1913,7 @@
         <w:rPr>
           <w:rStyle w:val="VerbatimChar"/>
         </w:rPr>
-        <w:t xml:space="preserve">│   ├── december_chart_inputs.csv      # 31 fixed December input rows (completed)</w:t>
+        <w:t xml:space="preserve">|   |-- validation.csv                 # 12,000 loads requiring predictions</w:t>
       </w:r>
       <w:r>
         <w:br/>
@@ -2193,7 +1922,7 @@
         <w:rPr>
           <w:rStyle w:val="VerbatimChar"/>
         </w:rPr>
-        <w:t xml:space="preserve">│   └── validation_predictions_template.csv</w:t>
+        <w:t xml:space="preserve">|   |-- december_chart_inputs.csv      # 31 fixed December input rows (completed)</w:t>
       </w:r>
       <w:r>
         <w:br/>
@@ -2202,7 +1931,7 @@
         <w:rPr>
           <w:rStyle w:val="VerbatimChar"/>
         </w:rPr>
-        <w:t xml:space="preserve">├── scorer_results/</w:t>
+        <w:t xml:space="preserve">|   `-- validation_predictions_template.csv</w:t>
       </w:r>
       <w:r>
         <w:br/>
@@ -2211,7 +1940,7 @@
         <w:rPr>
           <w:rStyle w:val="VerbatimChar"/>
         </w:rPr>
-        <w:t xml:space="preserve">│   └── candidate_december.png         # Generated official December chart</w:t>
+        <w:t xml:space="preserve">|-- scorer_results/</w:t>
       </w:r>
       <w:r>
         <w:br/>
@@ -2220,7 +1949,16 @@
         <w:rPr>
           <w:rStyle w:val="VerbatimChar"/>
         </w:rPr>
-        <w:t xml:space="preserve">└── validation_predictions.csv         # 12,000 final predictions (load_id,predicted_rate)</w:t>
+        <w:t xml:space="preserve">|   `-- candidate_december.png         # Generated official December chart</w:t>
+      </w:r>
+      <w:r>
+        <w:br/>
+      </w:r>
+      <w:r>
+        <w:rPr>
+          <w:rStyle w:val="VerbatimChar"/>
+        </w:rPr>
+        <w:t xml:space="preserve">`-- validation_predictions.csv         # 12,000 final predictions (load_id,predicted_rate)</w:t>
       </w:r>
     </w:p>
     <w:p>
@@ -2366,30 +2104,7 @@
         </w:numPr>
       </w:pPr>
       <w:r>
-        <w:t xml:space="preserve">Architecture: Residual LightGBM with</w:t>
-      </w:r>
-      <w:r>
-        <w:t xml:space="preserve"> </w:t>
-      </w:r>
-      <m:oMath>
-        <m:sSub>
-          <m:e>
-            <m:r>
-              <m:t>L</m:t>
-            </m:r>
-          </m:e>
-          <m:sub>
-            <m:r>
-              <m:t>1</m:t>
-            </m:r>
-          </m:sub>
-        </m:sSub>
-      </m:oMath>
-      <w:r>
-        <w:t xml:space="preserve"> </w:t>
-      </w:r>
-      <w:r>
-        <w:t xml:space="preserve">objective resulting in a 53.2% error reduction ($246 down to $115 MAE).</w:t>
+        <w:t xml:space="preserve">Architecture: Residual LightGBM with L1 objective resulting in a 53.2% error reduction ($246 down to $115 MAE).</w:t>
       </w:r>
     </w:p>
     <w:p>

</xml_diff>